<commit_message>
Corregir Capitulo 64: rasgos canonicos de AUDITORIA, parejas separadas, Seier con Vlad y Akame, e inclusion de Erza y Agnes Tachyon
</commit_message>
<xml_diff>
--- a/capitulos/64_Capitulo_64.docx
+++ b/capitulos/64_Capitulo_64.docx
@@ -66,7 +66,7 @@
           <w:color w:val="1C1C20"/>
           <w:sz w:val="22"/>
         </w:rPr>
-        <w:t>Detrás de nosotros, los motores rugientes de las motocicletas de Calydon se apagaron, dejando en el aire un leve rastro de vapor y ozono. Habíamos dejado atrás las aguas cristalinas y la arena dorada de la Costa Esmeralda; la brisa fresca del otoño capitalino nos daba la bienvenida a una nueva etapa.</w:t>
+        <w:t>Detrás, las motos del Páramo apagaron sus motores con un bufido metálico. Dejábamos atrás el calor y la arena de Costa Esmeralda; el aire fresco del otoño capitalino nos daba la bienvenida al segundo semestre.</w:t>
       </w:r>
     </w:p>
     <w:p>
@@ -80,7 +80,35 @@
           <w:color w:val="1C1C20"/>
           <w:sz w:val="22"/>
         </w:rPr>
-        <w:t>Apenas pusimos un pie sobre los adoquines del patio principal, el cambio en el ambiente fue palpable.</w:t>
+        <w:t>Apenas pisamos los adoquines del patio central, los cadetes de los cursos superiores se abrieron a nuestro paso, murmurando con respeto. La Medalla del León de Oro de Seier y los ecos de la victoria en la Roca Carmesí habían borrado para siempre las burlas hacia los antiguos parias.</w:t>
+      </w:r>
+    </w:p>
+    <w:p>
+      <w:pPr>
+        <w:spacing w:line="300" w:lineRule="auto" w:after="100"/>
+        <w:ind w:left="259"/>
+      </w:pPr>
+      <w:r>
+        <w:rPr>
+          <w:rFonts w:ascii="Georgia" w:hAnsi="Georgia"/>
+          <w:color w:val="1C1C20"/>
+          <w:sz w:val="22"/>
+        </w:rPr>
+        <w:t>—Vaya cambio —soltó Lighter ajustándose los guantes—. Parece que ahora los señoritos nobles aprendieron a agachar la cabeza.</w:t>
+      </w:r>
+    </w:p>
+    <w:p>
+      <w:pPr>
+        <w:spacing w:line="300" w:lineRule="auto" w:after="100"/>
+        <w:ind w:left="259"/>
+      </w:pPr>
+      <w:r>
+        <w:rPr>
+          <w:rFonts w:ascii="Georgia" w:hAnsi="Georgia"/>
+          <w:color w:val="1C1C20"/>
+          <w:sz w:val="22"/>
+        </w:rPr>
+        <w:t>—Más les vale —replicó Caesar King, ajustando la correa de su pesado escudo a la espalda—. Si alguno vuelve a decir que la gente del páramo huele a chatarra, le incrusto el gladius en el pupitre.</w:t>
       </w:r>
     </w:p>
     <w:p>
@@ -94,7 +122,7 @@
           <w:color w:val="1C1C20"/>
           <w:sz w:val="22"/>
         </w:rPr>
-        <w:t>Ya no había miradas de desprecio ni murmullos burlones hacia nuestros uniformes. Los cadetes de otros cursos que transitaban por los jardines se detenían en seco, abriéndonos paso con un respeto casi reverencial. Los ecos de la Batalla de la Roca Carmesí y la condecoración del León de Oro con Hojas de Roble habían sacudido hasta el último rincón de la capital.</w:t>
+        <w:t>Yami expulsó una densa nube de humo de su puro, caminando con las manos en los bolsillos junto a ellos:</w:t>
       </w:r>
     </w:p>
     <w:p>
@@ -108,49 +136,7 @@
           <w:color w:val="1C1C20"/>
           <w:sz w:val="22"/>
         </w:rPr>
-        <w:t>—Vaya, miren eso —soltó Lighter con una sonrisa de lado, ajustándose los guantes de cuero—. Parece que los señoritos nobles aprendieron modales mientras estábamos de pesca.</w:t>
-      </w:r>
-    </w:p>
-    <w:p>
-      <w:pPr>
-        <w:spacing w:line="300" w:lineRule="auto" w:after="100"/>
-        <w:ind w:left="259"/>
-      </w:pPr>
-      <w:r>
-        <w:rPr>
-          <w:rFonts w:ascii="Georgia" w:hAnsi="Georgia"/>
-          <w:color w:val="1C1C20"/>
-          <w:sz w:val="22"/>
-        </w:rPr>
-        <w:t>—Más les vale —bufó Caesar King con su habitual paso pesado, apoyando su enorme escudo a la espalda—. Si alguno vuelve a llamarnos 'escoria del páramo', le enseñaré a volar sin escoba.</w:t>
-      </w:r>
-    </w:p>
-    <w:p>
-      <w:pPr>
-        <w:spacing w:line="300" w:lineRule="auto" w:after="100"/>
-        <w:ind w:firstLine="403"/>
-      </w:pPr>
-      <w:r>
-        <w:rPr>
-          <w:rFonts w:ascii="Georgia" w:hAnsi="Georgia"/>
-          <w:color w:val="1C1C20"/>
-          <w:sz w:val="22"/>
-        </w:rPr>
-        <w:t>Yami expulsó una densa calada de su puro, caminando con las manos en los bolsillos junto a Caesar:</w:t>
-      </w:r>
-    </w:p>
-    <w:p>
-      <w:pPr>
-        <w:spacing w:line="300" w:lineRule="auto" w:after="100"/>
-        <w:ind w:left="259"/>
-      </w:pPr>
-      <w:r>
-        <w:rPr>
-          <w:rFonts w:ascii="Georgia" w:hAnsi="Georgia"/>
-          <w:color w:val="1C1C20"/>
-          <w:sz w:val="22"/>
-        </w:rPr>
-        <w:t>—No gastes saliva, jefa. El miedo educa más rápido que cualquier profesor de etiqueta.</w:t>
+        <w:t>—No gastes saliva, jefa. El miedo educa más rápido que cualquier profesor de modales.</w:t>
       </w:r>
     </w:p>
     <w:p>
@@ -178,7 +164,7 @@
           <w:color w:val="1C1C20"/>
           <w:sz w:val="22"/>
         </w:rPr>
-        <w:t>El sonido bronco de una campana de bronce retumbó desde la torre central, convocando a todos los cadetes hacia la Plaza de Armas.</w:t>
+        <w:t>El repique de la campana de bronce convocó a toda la academia a la Plaza de Armas.</w:t>
       </w:r>
     </w:p>
     <w:p>
@@ -192,7 +178,7 @@
           <w:color w:val="1C1C20"/>
           <w:sz w:val="22"/>
         </w:rPr>
-        <w:t>Frente a las imponentes escalinatas de mármol, el Instructor Jefe Gerald aguardaba con su uniforme de gala impecable y los brazos cruzados tras la espalda. Su rostro curtido por cien batallas lucía más severo que de costumbre.</w:t>
+        <w:t>Frente a las escalinatas de mármol, el Instructor Jefe Gerald esperaba de pie, con los brazos a la espalda y el rostro severo como una pared de granito:</w:t>
       </w:r>
     </w:p>
     <w:p>
@@ -206,7 +192,7 @@
           <w:color w:val="1C1C20"/>
           <w:sz w:val="22"/>
         </w:rPr>
-        <w:t>—¡Firmes todos! —rugió Gerald, acallando al instante los cuchicheos de los cientos de estudiantes reunidos—. ¡Bienvenidos al inicio del segundo semestre académico!</w:t>
+        <w:t>—¡Firmes todos! —su voz de trueno silenció de golpe los murmullos de cientos de estudiantes—. ¡Iniciamos el segundo semestre académico con un cambio radical dictado por el Alto Consejo y el Senado de Astraea!</w:t>
       </w:r>
     </w:p>
     <w:p>
@@ -220,7 +206,7 @@
           <w:color w:val="1C1C20"/>
           <w:sz w:val="22"/>
         </w:rPr>
-        <w:t>Gerald recorrió las filas con la mirada, deteniéndose apenas un segundo en nuestro grupo con un brillo de orgullo que no se molestó en disimular del todo.</w:t>
+        <w:t>Gerald recorrió las filas con la mirada antes de soltar la bomba:</w:t>
       </w:r>
     </w:p>
     <w:p>
@@ -234,7 +220,7 @@
           <w:color w:val="1C1C20"/>
           <w:sz w:val="22"/>
         </w:rPr>
-        <w:t>—Durante el receso estival, el Alto Consejo del Imperio y el Senado de Astraea han promulgado una reforma estructural inmediata y obligatoria —anunció con voz de trueno—. A partir de este ciclo, queda abolida la segregación de aulas por estatus nobiliario o linaje de cuna. Se acabaron los privilegios heredados y las aulas de casta. Ya no existen la Clase A-1 ni la Clase F-2.</w:t>
+        <w:t>—Queda abolida la segregación de aulas por linaje, dinero o casta de ingreso. Se acabaron los privilegios feudales. Ya no existen la Clase A-1 ni la Clase F-2.</w:t>
       </w:r>
     </w:p>
     <w:p>
@@ -248,7 +234,7 @@
           <w:color w:val="1C1C20"/>
           <w:sz w:val="22"/>
         </w:rPr>
-        <w:t>Una ola de murmullos indignados estalló entre los cadetes de familias condales y ducales.</w:t>
+        <w:t>Los nobles de familias condales se miraron entre sí, escandalizados.</w:t>
       </w:r>
     </w:p>
     <w:p>
@@ -262,7 +248,7 @@
           <w:color w:val="1C1C20"/>
           <w:sz w:val="22"/>
         </w:rPr>
-        <w:t>—¡Silencio! —bramó Gerald con tal fuerza que las baldosas vibraron—. A partir de hoy, todas las secciones serán heterogéneas y mixtas. Nobles, plebeyos, cadetes del Páramo Exterior y forasteros compartirán los mismos pupitres, las mismas asignaturas teóricas y los mismos barrotes de entrenamiento. Si alguien cree que su sangre azul vale más que el sudor y el acero de sus compañeros, las puertas de salida están abiertas.</w:t>
+        <w:t>—A partir de hoy, todas las secciones serán mixtas —bramó Gerald—. Nobles, plebeyos, cadetes del páramo y forasteros compartirán los mismos bancos y los mismos entrenamientos. Quien no lo tolere, tiene los portones abiertos para largarse a su mansión.</w:t>
       </w:r>
     </w:p>
     <w:p>
@@ -290,7 +276,7 @@
           <w:color w:val="1C1C20"/>
           <w:sz w:val="22"/>
         </w:rPr>
-        <w:t>Minutos después, la enorme pantalla de cristal rúnico en el centro de la plaza se iluminó, desplegando los listados de las nuevas secciones.</w:t>
+        <w:t>El cristal rúnico del patio destelló, proyectando los listados de las nuevas secciones.</w:t>
       </w:r>
     </w:p>
     <w:p>
@@ -304,7 +290,7 @@
           <w:color w:val="1C1C20"/>
           <w:sz w:val="22"/>
         </w:rPr>
-        <w:t>Piper Wheel fue la primera en correr hacia el frente, entrecerrando los ojos para leer los nombres grabados en luz mágica. De pronto, soltó un chillido lastimero:</w:t>
+        <w:t>Piper corrió la primera a buscar su nombre y pegó un grito que alertó a media plaza:</w:t>
       </w:r>
     </w:p>
     <w:p>
@@ -318,7 +304,21 @@
           <w:color w:val="1C1C20"/>
           <w:sz w:val="22"/>
         </w:rPr>
-        <w:t>—¡Nooo! ¡Oigan, esto es una tragedia! ¡Nos separaron a casi todos! ¡Me tocó en la Sección Seis con un montón de estirados de la vieja Clase B! ¡¿Quién me va a cuidar las herramientas y a probar mis galletas ahora?!</w:t>
+        <w:t>—¡Nooo! ¡Oigan, esto es una estafa! ¡Me mandaron a la Sección Seis con la gente de la antigua Clase B! ¡¿Quién me va a cuidar las tuercas ahora?!</w:t>
+      </w:r>
+    </w:p>
+    <w:p>
+      <w:pPr>
+        <w:spacing w:line="300" w:lineRule="auto" w:after="100"/>
+        <w:ind w:left="259"/>
+      </w:pPr>
+      <w:r>
+        <w:rPr>
+          <w:rFonts w:ascii="Georgia" w:hAnsi="Georgia"/>
+          <w:color w:val="1C1C20"/>
+          <w:sz w:val="22"/>
+        </w:rPr>
+        <w:t>—Deja de lloriquear, enana —se burló Caesar dándole un coscorrón cariñoso—. Si alguien te toca una llave inglesa, silba y voy a partirle el banco. A ver dónde caí yo... ¡¿Qué?! ¡¿Sección Cinco?!</w:t>
       </w:r>
     </w:p>
     <w:p>
@@ -332,7 +332,7 @@
           <w:color w:val="1C1C20"/>
           <w:sz w:val="22"/>
         </w:rPr>
-        <w:t>Caesar soltó una carcajada estruendosa, dándole un suave tirón de orejas a la mecánica:</w:t>
+        <w:t>Natsuki buscó su nombre en la misma columna y parpadeó sorprendido:</w:t>
       </w:r>
     </w:p>
     <w:p>
@@ -346,7 +346,7 @@
           <w:color w:val="1C1C20"/>
           <w:sz w:val="22"/>
         </w:rPr>
-        <w:t>—Deja el drama, enana. Si algún novato de la B se atreve a tocarte una sola tuerca, silbas y voy a partirle el pupitre en las costillas. Además, miren esto... a mí me mandaron a la Sección Tres. Y miren quién es mi compañero de banco.</w:t>
+        <w:t>—Espera... Caesar, ¡a mí también me tocó la Sección Cinco!</w:t>
       </w:r>
     </w:p>
     <w:p>
@@ -360,7 +360,7 @@
           <w:color w:val="1C1C20"/>
           <w:sz w:val="22"/>
         </w:rPr>
-        <w:t>Yami miró el cristal, entrecerró los ojos y soltó un suspiro resignado:</w:t>
+        <w:t>Caesar soltó una carcajada ronca, agarrando a Natsuki por el hombro con fuerza de tenaza:</w:t>
       </w:r>
     </w:p>
     <w:p>
@@ -374,7 +374,21 @@
           <w:color w:val="1C1C20"/>
           <w:sz w:val="22"/>
         </w:rPr>
-        <w:t>—Tenía que ser. Parece que tendré que aguantar tus rugidos también en clase de estrategia. Mientras no me tires tiza cuando esté durmiendo, sobreviviremos.</w:t>
+        <w:t>—¡Miren qué suerte! ¡Me tocó de compañero de banco el domador de cerdos! Prepárate, cuñado, que en clase de teoría táctica te voy a exigir el triple de flexiones.</w:t>
+      </w:r>
+    </w:p>
+    <w:p>
+      <w:pPr>
+        <w:spacing w:line="300" w:lineRule="auto" w:after="100"/>
+        <w:ind w:firstLine="403"/>
+      </w:pPr>
+      <w:r>
+        <w:rPr>
+          <w:rFonts w:ascii="Georgia" w:hAnsi="Georgia"/>
+          <w:color w:val="1C1C20"/>
+          <w:sz w:val="22"/>
+        </w:rPr>
+        <w:t>Lucy, con sus coletas rubias saltando de indignación, se abrió paso a empujones para ver la lista:</w:t>
       </w:r>
     </w:p>
     <w:p>
@@ -388,7 +402,35 @@
           <w:color w:val="1C1C20"/>
           <w:sz w:val="22"/>
         </w:rPr>
-        <w:t>—¿Dormir? ¡Ni lo sueñes, fumador! Te voy a tener despierto a codazos —le retó Caesar con una sonrisa pícara y desafiante que hizo sonreír a Yami de lado.</w:t>
+        <w:t>—¡¿Cómo que la Cinco?! ¡A mí me mandaron a la Sección Dos! ¡Eso es trampa! —Lucy clavó sus ojos dorados en Natsuki, con las mejillas ardiendo de rubor y los puños cerrados—. ¡Oye, Subaru, más te vale no descuidarte ni hacer tonterías con los nobles de tu clase! ¡Y si alguna chica de la nobleza se te acerca a pedirte apuntes, me avisas para quemarle la falda!</w:t>
+      </w:r>
+    </w:p>
+    <w:p>
+      <w:pPr>
+        <w:spacing w:line="300" w:lineRule="auto" w:after="100"/>
+        <w:ind w:left="259"/>
+      </w:pPr>
+      <w:r>
+        <w:rPr>
+          <w:rFonts w:ascii="Georgia" w:hAnsi="Georgia"/>
+          <w:color w:val="1C1C20"/>
+          <w:sz w:val="22"/>
+        </w:rPr>
+        <w:t>—Te lo prometo, Lucy —respondió Natsuki con una sonrisa tierna y tranquila, rascándose la nuca.</w:t>
+      </w:r>
+    </w:p>
+    <w:p>
+      <w:pPr>
+        <w:spacing w:line="300" w:lineRule="auto" w:after="100"/>
+        <w:ind w:left="259"/>
+      </w:pPr>
+      <w:r>
+        <w:rPr>
+          <w:rFonts w:ascii="Georgia" w:hAnsi="Georgia"/>
+          <w:color w:val="1C1C20"/>
+          <w:sz w:val="22"/>
+        </w:rPr>
+        <w:t>—¡Menos charla y más disciplina! —rugió una voz imponente a su espalda.</w:t>
       </w:r>
     </w:p>
     <w:p>
@@ -402,7 +444,7 @@
           <w:color w:val="1C1C20"/>
           <w:sz w:val="22"/>
         </w:rPr>
-        <w:t>A su lado, Ken chocó los puños con entusiasmo. Pequeñas llamaradas doradas brotaron de sus nudillos:</w:t>
+        <w:t>Erza Scarlet se cruzó de brazos, con su larga cabellera escarlata brillante reluciendo al sol sobre su armadura de placas plateadas:</w:t>
       </w:r>
     </w:p>
     <w:p>
@@ -416,21 +458,7 @@
           <w:color w:val="1C1C20"/>
           <w:sz w:val="22"/>
         </w:rPr>
-        <w:t>—¡A mí me da exactamente igual el número de aula! ¡Me pusieron en la Sección Cuatro con Burnice y un par de presumidos de la antigua A-1! ¡Seier, te juro que los voy a hacer sudar fuego en cada combate de entrenamiento!</w:t>
-      </w:r>
-    </w:p>
-    <w:p>
-      <w:pPr>
-        <w:spacing w:line="300" w:lineRule="auto" w:after="100"/>
-        <w:ind w:firstLine="403"/>
-      </w:pPr>
-      <w:r>
-        <w:rPr>
-          <w:rFonts w:ascii="Georgia" w:hAnsi="Georgia"/>
-          <w:color w:val="1C1C20"/>
-          <w:sz w:val="22"/>
-        </w:rPr>
-        <w:t>Burnice aplaudió entusiasmada dando saltitos:</w:t>
+        <w:t>—Lucy, estás en mi misma aula, la Sección Dos. Y conmigo de compañera no toleraré distracciones amorosas ni berrinches. Nos sentaremos al frente y seremos las mejores de la clase.</w:t>
       </w:r>
     </w:p>
     <w:p>
@@ -444,7 +472,21 @@
           <w:color w:val="1C1C20"/>
           <w:sz w:val="22"/>
         </w:rPr>
-        <w:t>—¡Siii! ¡Voy a prepararles mis cocteles chispeantes con canela y pimienta a todos los nuevos compañeros! ¡Vamos a encender esa clase desde el primer día!</w:t>
+        <w:t>—¡P-pero Erza...! —protestó Lucy con un puchero resignado.</w:t>
+      </w:r>
+    </w:p>
+    <w:p>
+      <w:pPr>
+        <w:spacing w:line="300" w:lineRule="auto" w:after="100"/>
+        <w:ind w:left="259"/>
+      </w:pPr>
+      <w:r>
+        <w:rPr>
+          <w:rFonts w:ascii="Georgia" w:hAnsi="Georgia"/>
+          <w:color w:val="1C1C20"/>
+          <w:sz w:val="22"/>
+        </w:rPr>
+        <w:t>—Dante Vance también está con nosotras —añadió Erza, señalando al trampero que limpiaba la recámara de su mosquete rúnico—. Mantendremos la compostura militar en todo momento.</w:t>
       </w:r>
     </w:p>
     <w:p>
@@ -472,7 +514,7 @@
           <w:color w:val="1C1C20"/>
           <w:sz w:val="22"/>
         </w:rPr>
-        <w:t>Cerca de allí, Natsuki buscaba su nombre en el panel rúnico con nerviosismo. De pronto, sus ojos se abrieron y una sonrisa sincera iluminó su rostro:</w:t>
+        <w:t>En otro rincón del cristal rúnico, Ken soltó una maldición al ver su nombre:</w:t>
       </w:r>
     </w:p>
     <w:p>
@@ -486,7 +528,21 @@
           <w:color w:val="1C1C20"/>
           <w:sz w:val="22"/>
         </w:rPr>
-        <w:t>—¡Estoy en la Sección Dos! Y... espera... ¡Lucy también está en la Dos!</w:t>
+        <w:t>—¡Maldita sea! ¡A mí me metieron en la Sección Cuatro con un montón de presumidos de la vieja A-1! ¡¿Y Burnice dónde está?!</w:t>
+      </w:r>
+    </w:p>
+    <w:p>
+      <w:pPr>
+        <w:spacing w:line="300" w:lineRule="auto" w:after="100"/>
+        <w:ind w:left="259"/>
+      </w:pPr>
+      <w:r>
+        <w:rPr>
+          <w:rFonts w:ascii="Georgia" w:hAnsi="Georgia"/>
+          <w:color w:val="1C1C20"/>
+          <w:sz w:val="22"/>
+        </w:rPr>
+        <w:t>—¡A mí me tocó la Sección Tres, Ken-Ken! —gritó Burnice White desde atrás, agitando una botella de licor chispeante con canela—. ¡No te preocupes! ¡Voy a prepararles bebidas picantes a los de la Tres para que no se duerman!</w:t>
       </w:r>
     </w:p>
     <w:p>
@@ -500,7 +556,7 @@
           <w:color w:val="1C1C20"/>
           <w:sz w:val="22"/>
         </w:rPr>
-        <w:t>Lucy, que estaba a su lado con los brazos cruzados y la barbilla en alto fingiendo desinterés, se puso roja como una manzana en cuanto escuchó su nombre. Trató de disimular con un mohín orgulloso:</w:t>
+        <w:t>A su lado, Lady Elysea de Vane se acomodó un mechón de su cabello plateado como luz de luna, mirando a Ken con sus ojos gélidos de color zafiro:</w:t>
       </w:r>
     </w:p>
     <w:p>
@@ -514,21 +570,7 @@
           <w:color w:val="1C1C20"/>
           <w:sz w:val="22"/>
         </w:rPr>
-        <w:t>—N-no te emociones tanto, tonto. Solo significa que tendré que vigilarte de cerca para que no hagas el ridículo frente a los nobles. Y más les vale a esos engreídos no causarte problemas, o mis pequeños jabalíes les quemarán los libros de texto.</w:t>
-      </w:r>
-    </w:p>
-    <w:p>
-      <w:pPr>
-        <w:spacing w:line="300" w:lineRule="auto" w:after="100"/>
-        <w:ind w:firstLine="403"/>
-      </w:pPr>
-      <w:r>
-        <w:rPr>
-          <w:rFonts w:ascii="Georgia" w:hAnsi="Georgia"/>
-          <w:color w:val="1C1C20"/>
-          <w:sz w:val="22"/>
-        </w:rPr>
-        <w:t>Natsuki rió bajito, inclinándose hacia ella para susurrarle con cariño:</w:t>
+        <w:t>—Cálmate, Ken. Yo estoy asignada a tu misma aula en la Sección Cuatro. Si los nobles de esa clase intentan faltarte al respeto por tu origen, mi estoque *Escarcha Silenciosa* les recordará cuál es su lugar.</w:t>
       </w:r>
     </w:p>
     <w:p>
@@ -542,77 +584,7 @@
           <w:color w:val="1C1C20"/>
           <w:sz w:val="22"/>
         </w:rPr>
-        <w:t>—Sé que me vas a cuidar, pequeña fiera.</w:t>
-      </w:r>
-    </w:p>
-    <w:p>
-      <w:pPr>
-        <w:spacing w:line="300" w:lineRule="auto" w:after="100"/>
-        <w:ind w:left="259"/>
-      </w:pPr>
-      <w:r>
-        <w:rPr>
-          <w:rFonts w:ascii="Georgia" w:hAnsi="Georgia"/>
-          <w:color w:val="1C1C20"/>
-          <w:sz w:val="22"/>
-        </w:rPr>
-        <w:t>—¡C-cállate y camina! —replicó Lucy dándole un codazo cómplice en las costillas, aunque sus dedos buscaron discretamente los de Natsuki por un instante.</w:t>
-      </w:r>
-    </w:p>
-    <w:p>
-      <w:pPr>
-        <w:spacing w:line="300" w:lineRule="auto" w:after="100"/>
-        <w:ind w:firstLine="403"/>
-      </w:pPr>
-      <w:r>
-        <w:rPr>
-          <w:rFonts w:ascii="Georgia" w:hAnsi="Georgia"/>
-          <w:color w:val="1C1C20"/>
-          <w:sz w:val="22"/>
-        </w:rPr>
-        <w:t>Renji Abarai se rascó la nuca mientras leía su asignación:</w:t>
-      </w:r>
-    </w:p>
-    <w:p>
-      <w:pPr>
-        <w:spacing w:line="300" w:lineRule="auto" w:after="100"/>
-        <w:ind w:left="259"/>
-      </w:pPr>
-      <w:r>
-        <w:rPr>
-          <w:rFonts w:ascii="Georgia" w:hAnsi="Georgia"/>
-          <w:color w:val="1C1C20"/>
-          <w:sz w:val="22"/>
-        </w:rPr>
-        <w:t>—A mí me mandaron a la Sección Cinco con Lighter y Vlad. Nada mal. Pura fuerza de choque.</w:t>
-      </w:r>
-    </w:p>
-    <w:p>
-      <w:pPr>
-        <w:spacing w:line="300" w:lineRule="auto" w:after="100"/>
-        <w:ind w:left="259"/>
-      </w:pPr>
-      <w:r>
-        <w:rPr>
-          <w:rFonts w:ascii="Georgia" w:hAnsi="Georgia"/>
-          <w:color w:val="1C1C20"/>
-          <w:sz w:val="22"/>
-        </w:rPr>
-        <w:t>—Pórtate bien, Renji —le aconsejó Rukia con una sonrisa serena y dulce—. A mí me tocó en la Sección Uno junto a Akame y Hoshina.</w:t>
-      </w:r>
-    </w:p>
-    <w:p>
-      <w:pPr>
-        <w:spacing w:line="300" w:lineRule="auto" w:after="100"/>
-        <w:ind w:left="259"/>
-      </w:pPr>
-      <w:r>
-        <w:rPr>
-          <w:rFonts w:ascii="Georgia" w:hAnsi="Georgia"/>
-          <w:color w:val="1C1C20"/>
-          <w:sz w:val="22"/>
-        </w:rPr>
-        <w:t>—Ten por seguro que ningún noble se sobrepasará en esa aula —comentó Akame con tono tranquilo, masticando una tira de carne seca—. No mientras tengamos hambre de entrenar.</w:t>
+        <w:t>—¡Ja! Me gusta cómo hablas, muñeca de hielo —sonrió Ken, chocando los puños con chispas solares.</w:t>
       </w:r>
     </w:p>
     <w:p>
@@ -640,7 +612,7 @@
           <w:color w:val="1C1C20"/>
           <w:sz w:val="22"/>
         </w:rPr>
-        <w:t>Lortelle Kecheln se colocó a mi derecha, acomodándose un mechón rubio tras la oreja con una mirada brillante de astucia:</w:t>
+        <w:t>Yami, apoyado contra una columna, bostezó mientras leía su destino:</w:t>
       </w:r>
     </w:p>
     <w:p>
@@ -654,7 +626,7 @@
           <w:color w:val="1C1C20"/>
           <w:sz w:val="22"/>
         </w:rPr>
-        <w:t>—¿Te das cuenta de lo que esto significa en realidad, Seier? El senado creyó que al dispersarnos debilitaría la cohesión de la F-2, pero en realidad nos acaban de regalar influencia directa en cada aula del campus. La red comercial y de información de la Compañía Elte se moverá el doble de rápido.</w:t>
+        <w:t>—Sección Seis. Genial. Parece que me toca compartir aula con Kaoruko y Lighter.</w:t>
       </w:r>
     </w:p>
     <w:p>
@@ -668,7 +640,7 @@
           <w:color w:val="1C1C20"/>
           <w:sz w:val="22"/>
         </w:rPr>
-        <w:t>Lady Elysea asintió con porte aristocrático impecable:</w:t>
+        <w:t>Kaoruko Waguri, con su cabello azabache cayéndole suave sobre los hombros y sus ojos cálidos llenos de dulzura, apretó su estuche de cuero contra el pecho:</w:t>
       </w:r>
     </w:p>
     <w:p>
@@ -682,7 +654,7 @@
           <w:color w:val="1C1C20"/>
           <w:sz w:val="22"/>
         </w:rPr>
-        <w:t>—Concuerdo plenamente con Lortelle. En mi aula hay tres herederos que solían burlarse de nosotros. Ahora tendrán que pedirnos consejo si quieren aprobar las pruebas de campo.</w:t>
+        <w:t>—Me aseguraré de llevar galletas y pasteles de manzana para todos, Yami-san... aunque me da pena no estar sentada junto a Seier...</w:t>
       </w:r>
     </w:p>
     <w:p>
@@ -696,7 +668,7 @@
           <w:color w:val="1C1C20"/>
           <w:sz w:val="22"/>
         </w:rPr>
-        <w:t>Kaoruko tomó mi mano con delicadeza, entrelazando sus dedos tibios con los míos mientras me miraba con una dulzura inquebrantable:</w:t>
+        <w:t>Lighter le dio una palmada en el hombro a la repostera:</w:t>
       </w:r>
     </w:p>
     <w:p>
@@ -710,7 +682,21 @@
           <w:color w:val="1C1C20"/>
           <w:sz w:val="22"/>
         </w:rPr>
-        <w:t>—Lo mejor de todo es que tú y yo estamos juntos en la Sección Uno, Seier. No importa qué otros cadetes entren... mi lugar siempre será a tu lado.</w:t>
+        <w:t>—No te preocupes, Kaoruko. Nadie se va a propasar en nuestra clase. Quien te mire feo se gana un jab de combustión.</w:t>
+      </w:r>
+    </w:p>
+    <w:p>
+      <w:pPr>
+        <w:spacing w:line="300" w:lineRule="auto" w:after="100"/>
+        <w:ind w:firstLine="403"/>
+      </w:pPr>
+      <w:r>
+        <w:rPr>
+          <w:rFonts w:ascii="Georgia" w:hAnsi="Georgia"/>
+          <w:color w:val="1C1C20"/>
+          <w:sz w:val="22"/>
+        </w:rPr>
+        <w:t>Mientras tanto, una chica con bata blanca manchada de reactivos, despeinada y con un matraz burbujeante en la mano se acercó a tropezones:</w:t>
       </w:r>
     </w:p>
     <w:p>
@@ -724,7 +710,35 @@
           <w:color w:val="1C1C20"/>
           <w:sz w:val="22"/>
         </w:rPr>
-        <w:t>—Y el mío junto al de ustedes tres —le respondí, apretando su mano con devoción.</w:t>
+        <w:t>—¡Fascinante! ¡Absolutamente caótico! —exclamó Agnes Tachyon, ajustándose las gafas protectoras mientras un humo violáceo salía de su frasco—. ¡Me asignaron a la Sección Cinco con Caesar y Natsuki! ¡El balance termodinámico de esa sala va a ser una maravilla para mis experimentos de fósforo!</w:t>
+      </w:r>
+    </w:p>
+    <w:p>
+      <w:pPr>
+        <w:spacing w:line="300" w:lineRule="auto" w:after="100"/>
+        <w:ind w:firstLine="403"/>
+      </w:pPr>
+      <w:r>
+        <w:rPr>
+          <w:rFonts w:ascii="Georgia" w:hAnsi="Georgia"/>
+          <w:color w:val="1C1C20"/>
+          <w:sz w:val="22"/>
+        </w:rPr>
+        <w:t>Natsuki tragó saliva, mirando el frasco con pánico evidente:</w:t>
+      </w:r>
+    </w:p>
+    <w:p>
+      <w:pPr>
+        <w:spacing w:line="300" w:lineRule="auto" w:after="100"/>
+        <w:ind w:left="259"/>
+      </w:pPr>
+      <w:r>
+        <w:rPr>
+          <w:rFonts w:ascii="Georgia" w:hAnsi="Georgia"/>
+          <w:color w:val="1C1C20"/>
+          <w:sz w:val="22"/>
+        </w:rPr>
+        <w:t>—Por favor, señorita Agnes... prométame que no detonará nada dentro del aula.</w:t>
       </w:r>
     </w:p>
     <w:p>
@@ -752,7 +766,7 @@
           <w:color w:val="1C1C20"/>
           <w:sz w:val="22"/>
         </w:rPr>
-        <w:t>Di un paso al frente y llamé la atención de todos con un silbido agudo. El grupo entero —los catorce guerreros que habíamos desafiado a la muerte en las trincheras— formó un círculo apretado alrededor de mí.</w:t>
+        <w:t>Por su parte, Renji Abarai se tiraba de su coleta roja encendida mirando el cristal:</w:t>
       </w:r>
     </w:p>
     <w:p>
@@ -766,7 +780,21 @@
           <w:color w:val="1C1C20"/>
           <w:sz w:val="22"/>
         </w:rPr>
-        <w:t>—Miren a su alrededor, muchachos —les dije con voz firme y serena—. Un aula de clases era solo un cartel de madera colgado en una puerta. La F-2 nunca fueron cuatro paredes de piedra. La F-2 somos nosotros.</w:t>
+        <w:t>—¡¿Es una broma?! ¡Me mandaron a la Sección Siete con Freya y Zemina! ¡¿Y Rukia dónde quedó?!</w:t>
+      </w:r>
+    </w:p>
+    <w:p>
+      <w:pPr>
+        <w:spacing w:line="300" w:lineRule="auto" w:after="100"/>
+        <w:ind w:left="259"/>
+      </w:pPr>
+      <w:r>
+        <w:rPr>
+          <w:rFonts w:ascii="Georgia" w:hAnsi="Georgia"/>
+          <w:color w:val="1C1C20"/>
+          <w:sz w:val="22"/>
+        </w:rPr>
+        <w:t>—Estoy en la Sección Tres con Burnice, Hoshina y Pulchra, Renji —respondió Rukia Kuchiki con su calma habitual, con su cabello negro azabache y mechón frontal enmarcando su rostro menudo y ojos violetas—. No hagas un escándalo innecesario. Nos veremos en el almuerzo y en los entrenamientos libres.</w:t>
       </w:r>
     </w:p>
     <w:p>
@@ -780,7 +808,7 @@
           <w:color w:val="1C1C20"/>
           <w:sz w:val="22"/>
         </w:rPr>
-        <w:t>Todos asintieron con rostros decididos y miradas encendidas.</w:t>
+        <w:t>Lortelle Kecheln, con su cabello castaño claro con reflejos dorados y una sonrisa calculadora en sus ojos verdes felinos, cruzó los brazos satisfecha:</w:t>
       </w:r>
     </w:p>
     <w:p>
@@ -794,7 +822,35 @@
           <w:color w:val="1C1C20"/>
           <w:sz w:val="22"/>
         </w:rPr>
-        <w:t>—No importa si de ocho a dos de la tarde nos sentamos en pupitres distintos. En los patios de combate, en los comedores, en los calabozos y en la vida real, seguimos siendo la misma manada indestructible. En este nuevo semestre todos nosotros cumpliremos los diecisiete años. Vamos a demostrarle a este imperio que no importa dónde nos pongan... Astraea entera ahora camina a nuestro paso.</w:t>
+        <w:t>—A mí también me tocó la Sección Siete, Renji. No pongas esa cara. Tener a la F-2 desparramada en todas las aulas es el mejor negocio que pudimos pedir. La Compañía Elte tendrá ojos y oídos en cada rincón de la academia.</w:t>
+      </w:r>
+    </w:p>
+    <w:p>
+      <w:pPr>
+        <w:spacing w:before="280" w:after="280"/>
+        <w:jc w:val="center"/>
+      </w:pPr>
+      <w:r>
+        <w:rPr>
+          <w:rFonts w:ascii="Georgia" w:hAnsi="Georgia"/>
+          <w:color w:val="A082B4"/>
+          <w:sz w:val="22"/>
+        </w:rPr>
+        <w:t>✦   ✦   ✦</w:t>
+      </w:r>
+    </w:p>
+    <w:p>
+      <w:pPr>
+        <w:spacing w:line="300" w:lineRule="auto" w:after="100"/>
+        <w:ind w:firstLine="403"/>
+      </w:pPr>
+      <w:r>
+        <w:rPr>
+          <w:rFonts w:ascii="Georgia" w:hAnsi="Georgia"/>
+          <w:color w:val="1C1C20"/>
+          <w:sz w:val="22"/>
+        </w:rPr>
+        <w:t>Vlad se acercó a mi costado, impecable con su porte de caballero noble y su espada bastarda al cinto:</w:t>
       </w:r>
     </w:p>
     <w:p>
@@ -808,7 +864,49 @@
           <w:color w:val="1C1C20"/>
           <w:sz w:val="22"/>
         </w:rPr>
-        <w:t>—¡¡ASÍ SE HABLA!! —rugió Ken alzando el puño al cielo.</w:t>
+        <w:t>—Seier, ¿ya viste la Sección Uno?</w:t>
+      </w:r>
+    </w:p>
+    <w:p>
+      <w:pPr>
+        <w:spacing w:line="300" w:lineRule="auto" w:after="100"/>
+        <w:ind w:firstLine="403"/>
+      </w:pPr>
+      <w:r>
+        <w:rPr>
+          <w:rFonts w:ascii="Georgia" w:hAnsi="Georgia"/>
+          <w:color w:val="1C1C20"/>
+          <w:sz w:val="22"/>
+        </w:rPr>
+        <w:t>Miré el encabezado del cristal.</w:t>
+      </w:r>
+    </w:p>
+    <w:p>
+      <w:pPr>
+        <w:spacing w:line="300" w:lineRule="auto" w:after="100"/>
+        <w:ind w:firstLine="403"/>
+      </w:pPr>
+      <w:r>
+        <w:rPr>
+          <w:rFonts w:ascii="Georgia" w:hAnsi="Georgia"/>
+          <w:color w:val="1C1C20"/>
+          <w:sz w:val="22"/>
+        </w:rPr>
+        <w:t>En la Sección Uno figuraban tres nombres muy claros: **Seier Silva**, **Vlad** y **Akame**.</w:t>
+      </w:r>
+    </w:p>
+    <w:p>
+      <w:pPr>
+        <w:spacing w:line="300" w:lineRule="auto" w:after="100"/>
+        <w:ind w:firstLine="403"/>
+      </w:pPr>
+      <w:r>
+        <w:rPr>
+          <w:rFonts w:ascii="Georgia" w:hAnsi="Georgia"/>
+          <w:color w:val="1C1C20"/>
+          <w:sz w:val="22"/>
+        </w:rPr>
+        <w:t>Akame dio un mordisco a un trozo de cecina que llevaba en la mano, con sus ojos rojos penetrantes fijos en la lista:</w:t>
       </w:r>
     </w:p>
     <w:p>
@@ -822,7 +920,21 @@
           <w:color w:val="1C1C20"/>
           <w:sz w:val="22"/>
         </w:rPr>
-        <w:t>—¡Aplastaremos a quien se interponga! —gritó Caesar chocando su escudo contra el puño de Yami.</w:t>
+        <w:t>—Buena combinación. Si algún noble busca pelea en nuestra aula, no durará mucho.</w:t>
+      </w:r>
+    </w:p>
+    <w:p>
+      <w:pPr>
+        <w:spacing w:line="300" w:lineRule="auto" w:after="100"/>
+        <w:ind w:left="259"/>
+      </w:pPr>
+      <w:r>
+        <w:rPr>
+          <w:rFonts w:ascii="Georgia" w:hAnsi="Georgia"/>
+          <w:color w:val="1C1C20"/>
+          <w:sz w:val="22"/>
+        </w:rPr>
+        <w:t>—Totalmente de acuerdo —asintió Vlad con una sonrisa marcial—. Tenemos la vanguardia más pesada de la academia en la misma sala.</w:t>
       </w:r>
     </w:p>
     <w:p>
@@ -836,7 +948,21 @@
           <w:color w:val="1C1C20"/>
           <w:sz w:val="22"/>
         </w:rPr>
-        <w:t>Extendí mi mano hacia el centro y todos los demás —Kaoruko, Lortelle, Elysea, Yami, Caesar, Ken, Burnice, Natsuki, Lucy, Piper, Lighter, Renji, Rukia, Akame, Pulchra y Hoshina— apilaron las suyas sobre la mía en un juramento silencioso y feroz.</w:t>
+        <w:t>Di dos pasos al frente y solté un silbido agudo que resonó por toda la plaza. De inmediato, los dieciséis guerreros que habíamos sobrevivido al asedio Skaven se reunieron a mi alrededor, formando un círculo compacto y blindado.</w:t>
+      </w:r>
+    </w:p>
+    <w:p>
+      <w:pPr>
+        <w:spacing w:line="300" w:lineRule="auto" w:after="100"/>
+        <w:ind w:left="259"/>
+      </w:pPr>
+      <w:r>
+        <w:rPr>
+          <w:rFonts w:ascii="Georgia" w:hAnsi="Georgia"/>
+          <w:color w:val="1C1C20"/>
+          <w:sz w:val="22"/>
+        </w:rPr>
+        <w:t>—Escuchen bien todos —dije, mirando a cada uno a los ojos—. Las parejas no están juntas. Las aulas no tienen el cartel de la F-2. Pero un aula solo son cuatro paredes de ladrillo. La verdadera F-2 somos nosotros.</w:t>
       </w:r>
     </w:p>
     <w:p>
@@ -850,7 +976,49 @@
           <w:color w:val="1C1C20"/>
           <w:sz w:val="22"/>
         </w:rPr>
-        <w:t>Las clases mixtas acababan de comenzar, pero la hermandad de la F-2 ya era eterna.</w:t>
+        <w:t>Ken sonrió con ferocidad. Caesar levantó el pulgar. Lucy asintió decidida junto a Erza. Kaoruko me miró con devoción absoluta, y Elysea y Lortelle me dedicaron sonrisas cómplices.</w:t>
+      </w:r>
+    </w:p>
+    <w:p>
+      <w:pPr>
+        <w:spacing w:line="300" w:lineRule="auto" w:after="100"/>
+        <w:ind w:left="259"/>
+      </w:pPr>
+      <w:r>
+        <w:rPr>
+          <w:rFonts w:ascii="Georgia" w:hAnsi="Georgia"/>
+          <w:color w:val="1C1C20"/>
+          <w:sz w:val="22"/>
+        </w:rPr>
+        <w:t>—En este semestre todos cumpliremos los diecisiete años —continué con voz firme—. Vamos a conquistar cada una de las aulas en las que nos metieron. Demostraremos que no importa dónde nos sienten: Astraea entera ahora nos pertenece.</w:t>
+      </w:r>
+    </w:p>
+    <w:p>
+      <w:pPr>
+        <w:spacing w:line="300" w:lineRule="auto" w:after="100"/>
+        <w:ind w:left="259"/>
+      </w:pPr>
+      <w:r>
+        <w:rPr>
+          <w:rFonts w:ascii="Georgia" w:hAnsi="Georgia"/>
+          <w:color w:val="1C1C20"/>
+          <w:sz w:val="22"/>
+        </w:rPr>
+        <w:t>—¡¡POR LA CLASE F-2!! —rugieron todos al unísono, chocando puños y armas bajo el cielo otoñal de la capital.</w:t>
+      </w:r>
+    </w:p>
+    <w:p>
+      <w:pPr>
+        <w:spacing w:line="300" w:lineRule="auto" w:after="100"/>
+        <w:ind w:firstLine="403"/>
+      </w:pPr>
+      <w:r>
+        <w:rPr>
+          <w:rFonts w:ascii="Georgia" w:hAnsi="Georgia"/>
+          <w:color w:val="1C1C20"/>
+          <w:sz w:val="22"/>
+        </w:rPr>
+        <w:t>El segundo semestre había comenzado, y la leyenda apenas estaba empezando.</w:t>
       </w:r>
     </w:p>
     <w:sectPr>

</xml_diff>